<commit_message>
NACIE TECDOC: update Chapter 3 source, normalized content, and image assets
</commit_message>
<xml_diff>
--- a/01-source/chapters/03-chapter03-v01.docx
+++ b/01-source/chapters/03-chapter03-v01.docx
@@ -60,128 +60,74 @@
           <w:szCs w:val="24"/>
           <w:lang w:val="en-GB"/>
         </w:rPr>
-        <w:t xml:space="preserve">The NACIE-UP facility is a rectangular loop composed of two vertical pipes (inner diameter 62.68 mm), with an overall height of approximately 7.7 m, and two horizontal pipes (inner diameter 62.68 mm) each 2.4 m in length. A prototypical wire-spaced fuel pin bundle simulator (FPS) is installed in the lower section of the riser. The FPS and its associated instrumentation are described in detail in subsequent sections. A heat exchanger (HX) </w:t>
-      </w:r>
-      <w:proofErr w:type="gramStart"/>
+        <w:t xml:space="preserve">The NACIE-UP facility is a rectangular loop composed of two vertical pipes (inner diameter 62.68 mm), with an overall height of approximately 7.7 m, and two horizontal pipes (inner diameter 62.68 mm) each 2.4 m in length. A prototypical wire-spaced fuel pin bundle simulator (FPS) is installed in the lower section of the riser. The FPS and its associated instrumentation are described in detail in subsequent sections. A heat exchanger (HX) is located in the upper portion of the downcomer, as illustrated in </w:t>
+      </w:r>
+      <w:r>
+        <w:rPr>
+          <w:rFonts w:ascii="Times New Roman" w:hAnsi="Times New Roman" w:cs="Times New Roman"/>
+          <w:szCs w:val="24"/>
+        </w:rPr>
+        <w:fldChar w:fldCharType="begin"/>
+      </w:r>
+      <w:r>
+        <w:rPr>
+          <w:rFonts w:ascii="Times New Roman" w:hAnsi="Times New Roman" w:cs="Times New Roman"/>
+          <w:szCs w:val="24"/>
+          <w:lang w:val="en-US"/>
+        </w:rPr>
+        <w:instrText xml:space="preserve"> REF _Ref65226591 \h  \* MERGEFORMAT </w:instrText>
+      </w:r>
+      <w:r>
+        <w:rPr>
+          <w:rFonts w:ascii="Times New Roman" w:hAnsi="Times New Roman" w:cs="Times New Roman"/>
+          <w:szCs w:val="24"/>
+        </w:rPr>
+      </w:r>
+      <w:r>
+        <w:rPr>
+          <w:rFonts w:ascii="Times New Roman" w:hAnsi="Times New Roman" w:cs="Times New Roman"/>
+          <w:szCs w:val="24"/>
+        </w:rPr>
+        <w:fldChar w:fldCharType="separate"/>
+      </w:r>
+      <w:r>
+        <w:rPr>
+          <w:rFonts w:ascii="Times New Roman" w:hAnsi="Times New Roman" w:cs="Times New Roman"/>
+          <w:lang w:val="en-US"/>
+        </w:rPr>
+        <w:t xml:space="preserve">Figure </w:t>
+      </w:r>
+      <w:r>
+        <w:rPr>
+          <w:rFonts w:ascii="Times New Roman" w:hAnsi="Times New Roman" w:cs="Times New Roman"/>
+          <w:noProof/>
+          <w:lang w:val="en-US"/>
+        </w:rPr>
+        <w:t>3</w:t>
+      </w:r>
+      <w:r>
+        <w:rPr>
+          <w:rFonts w:ascii="Times New Roman" w:hAnsi="Times New Roman" w:cs="Times New Roman"/>
+          <w:noProof/>
+          <w:lang w:val="en-US"/>
+        </w:rPr>
+        <w:noBreakHyphen/>
+        <w:t>1</w:t>
+      </w:r>
+      <w:r>
+        <w:rPr>
+          <w:rFonts w:ascii="Times New Roman" w:hAnsi="Times New Roman" w:cs="Times New Roman"/>
+          <w:szCs w:val="24"/>
+        </w:rPr>
+        <w:fldChar w:fldCharType="end"/>
+      </w:r>
       <w:r>
         <w:rPr>
           <w:rFonts w:ascii="Times New Roman" w:hAnsi="Times New Roman" w:cs="Times New Roman"/>
           <w:szCs w:val="24"/>
           <w:lang w:val="en-GB"/>
         </w:rPr>
-        <w:t>is located in</w:t>
-      </w:r>
-      <w:proofErr w:type="gramEnd"/>
-      <w:r>
-        <w:rPr>
-          <w:rFonts w:ascii="Times New Roman" w:hAnsi="Times New Roman" w:cs="Times New Roman"/>
-          <w:szCs w:val="24"/>
-          <w:lang w:val="en-GB"/>
-        </w:rPr>
-        <w:t xml:space="preserve"> the upper portion of the downcomer, as illustrated in </w:t>
-      </w:r>
-      <w:r>
-        <w:rPr>
-          <w:rFonts w:ascii="Times New Roman" w:hAnsi="Times New Roman" w:cs="Times New Roman"/>
-          <w:szCs w:val="24"/>
-        </w:rPr>
-        <w:fldChar w:fldCharType="begin"/>
-      </w:r>
-      <w:r>
-        <w:rPr>
-          <w:rFonts w:ascii="Times New Roman" w:hAnsi="Times New Roman" w:cs="Times New Roman"/>
-          <w:szCs w:val="24"/>
-          <w:lang w:val="en-US"/>
-        </w:rPr>
-        <w:instrText xml:space="preserve"> REF _Ref65226591 \h  \* MERGEFORMAT </w:instrText>
-      </w:r>
-      <w:r>
-        <w:rPr>
-          <w:rFonts w:ascii="Times New Roman" w:hAnsi="Times New Roman" w:cs="Times New Roman"/>
-          <w:szCs w:val="24"/>
-        </w:rPr>
-      </w:r>
-      <w:r>
-        <w:rPr>
-          <w:rFonts w:ascii="Times New Roman" w:hAnsi="Times New Roman" w:cs="Times New Roman"/>
-          <w:szCs w:val="24"/>
-        </w:rPr>
-        <w:fldChar w:fldCharType="separate"/>
-      </w:r>
-      <w:r>
-        <w:rPr>
-          <w:rFonts w:ascii="Times New Roman" w:hAnsi="Times New Roman" w:cs="Times New Roman"/>
-          <w:lang w:val="en-US"/>
-        </w:rPr>
-        <w:t xml:space="preserve">Figure </w:t>
-      </w:r>
-      <w:r>
-        <w:rPr>
-          <w:rFonts w:ascii="Times New Roman" w:hAnsi="Times New Roman" w:cs="Times New Roman"/>
-          <w:noProof/>
-          <w:lang w:val="en-US"/>
-        </w:rPr>
-        <w:t>3</w:t>
-      </w:r>
-      <w:r>
-        <w:rPr>
-          <w:rFonts w:ascii="Times New Roman" w:hAnsi="Times New Roman" w:cs="Times New Roman"/>
-          <w:noProof/>
-          <w:lang w:val="en-US"/>
-        </w:rPr>
-        <w:noBreakHyphen/>
-        <w:t>1</w:t>
-      </w:r>
-      <w:r>
-        <w:rPr>
-          <w:rFonts w:ascii="Times New Roman" w:hAnsi="Times New Roman" w:cs="Times New Roman"/>
-          <w:szCs w:val="24"/>
-        </w:rPr>
-        <w:fldChar w:fldCharType="end"/>
-      </w:r>
-      <w:r>
-        <w:rPr>
-          <w:rFonts w:ascii="Times New Roman" w:hAnsi="Times New Roman" w:cs="Times New Roman"/>
-          <w:szCs w:val="24"/>
-          <w:lang w:val="en-GB"/>
-        </w:rPr>
-        <w:t xml:space="preserve">; a comprehensive description of the HX is provided later. The vertical distance between the </w:t>
-      </w:r>
-      <w:proofErr w:type="spellStart"/>
-      <w:r>
-        <w:rPr>
-          <w:rFonts w:ascii="Times New Roman" w:hAnsi="Times New Roman" w:cs="Times New Roman"/>
-          <w:szCs w:val="24"/>
-          <w:lang w:val="en-GB"/>
-        </w:rPr>
-        <w:t>center</w:t>
-      </w:r>
-      <w:proofErr w:type="spellEnd"/>
-      <w:r>
-        <w:rPr>
-          <w:rFonts w:ascii="Times New Roman" w:hAnsi="Times New Roman" w:cs="Times New Roman"/>
-          <w:szCs w:val="24"/>
-          <w:lang w:val="en-GB"/>
-        </w:rPr>
-        <w:t xml:space="preserve"> of the heated section and the </w:t>
-      </w:r>
-      <w:proofErr w:type="spellStart"/>
-      <w:r>
-        <w:rPr>
-          <w:rFonts w:ascii="Times New Roman" w:hAnsi="Times New Roman" w:cs="Times New Roman"/>
-          <w:szCs w:val="24"/>
-          <w:lang w:val="en-GB"/>
-        </w:rPr>
-        <w:t>center</w:t>
-      </w:r>
-      <w:proofErr w:type="spellEnd"/>
-      <w:r>
-        <w:rPr>
-          <w:rFonts w:ascii="Times New Roman" w:hAnsi="Times New Roman" w:cs="Times New Roman"/>
-          <w:szCs w:val="24"/>
-          <w:lang w:val="en-GB"/>
-        </w:rPr>
-        <w:t xml:space="preserve"> of the heat exchanger, H, is 5.5 m. For the experiments discussed in this work, only the high-power section of the heat exchanger was employed.</w:t>
+        <w:t>; a comprehensive description of the HX is provided later. The vertical distance between the center of the heated section and the center of the heat exchanger, H, is 5.5 m. For the experiments discussed in this work, only the high-power section of the heat exchanger was employed.</w:t>
       </w:r>
     </w:p>
     <w:p>
@@ -1098,7 +1044,7 @@
           <v:shape id="_x0000_i1025" type="#_x0000_t75" style="width:450.75pt;height:612pt" o:ole="">
             <v:imagedata r:id="rId10" o:title=""/>
           </v:shape>
-          <o:OLEObject Type="Embed" ProgID="Acrobat.Document.DC" ShapeID="_x0000_i1025" DrawAspect="Content" ObjectID="_1833778910" r:id="rId11"/>
+          <o:OLEObject Type="Embed" ProgID="Acrobat.Document.DC" ShapeID="_x0000_i1025" DrawAspect="Content" ObjectID="_1839043331" r:id="rId11"/>
         </w:object>
       </w:r>
       <w:bookmarkStart w:id="5" w:name="_Toc62395853"/>
@@ -1720,43 +1666,7 @@
           <w:szCs w:val="24"/>
           <w:lang w:val="en-US"/>
         </w:rPr>
-        <w:t xml:space="preserve">The component is made by a flanged pipe (SS) with </w:t>
-      </w:r>
-      <w:proofErr w:type="gramStart"/>
-      <w:r>
-        <w:rPr>
-          <w:rFonts w:asciiTheme="majorBidi" w:hAnsiTheme="majorBidi" w:cstheme="majorBidi"/>
-          <w:szCs w:val="24"/>
-          <w:lang w:val="en-US"/>
-        </w:rPr>
-        <w:t>an</w:t>
-      </w:r>
-      <w:proofErr w:type="gramEnd"/>
-      <w:r>
-        <w:rPr>
-          <w:rFonts w:asciiTheme="majorBidi" w:hAnsiTheme="majorBidi" w:cstheme="majorBidi"/>
-          <w:szCs w:val="24"/>
-          <w:lang w:val="en-US"/>
-        </w:rPr>
-        <w:t xml:space="preserve"> heater developed by </w:t>
-      </w:r>
-      <w:proofErr w:type="spellStart"/>
-      <w:r>
-        <w:rPr>
-          <w:rFonts w:asciiTheme="majorBidi" w:hAnsiTheme="majorBidi" w:cstheme="majorBidi"/>
-          <w:szCs w:val="24"/>
-          <w:lang w:val="en-US"/>
-        </w:rPr>
-        <w:t>Thermocoax</w:t>
-      </w:r>
-      <w:proofErr w:type="spellEnd"/>
-      <w:r>
-        <w:rPr>
-          <w:rFonts w:asciiTheme="majorBidi" w:hAnsiTheme="majorBidi" w:cstheme="majorBidi"/>
-          <w:szCs w:val="24"/>
-          <w:lang w:val="en-US"/>
-        </w:rPr>
-        <w:t xml:space="preserve"> (6 kW maximum power), a static mixer, 2 Resistance Temperature Detector (RTD) and an internal RTD in the bulb. The mass flow rate will be computed by the thermal balance:</w:t>
+        <w:t>The component is made by a flanged pipe (SS) with an heater developed by Thermocoax (6 kW maximum power), a static mixer, 2 Resistance Temperature Detector (RTD) and an internal RTD in the bulb. The mass flow rate will be computed by the thermal balance:</w:t>
       </w:r>
     </w:p>
     <w:p>
@@ -1826,7 +1736,7 @@
                 <v:shape id="_x0000_i1026" type="#_x0000_t75" style="width:92.25pt;height:37.5pt" o:ole="">
                   <v:imagedata r:id="rId13" o:title=""/>
                 </v:shape>
-                <o:OLEObject Type="Embed" ProgID="Equation.DSMT4" ShapeID="_x0000_i1026" DrawAspect="Content" ObjectID="_1833778911" r:id="rId14"/>
+                <o:OLEObject Type="Embed" ProgID="Equation.DSMT4" ShapeID="_x0000_i1026" DrawAspect="Content" ObjectID="_1839043332" r:id="rId14"/>
               </w:object>
             </w:r>
           </w:p>
@@ -1890,55 +1800,7 @@
           <w:rFonts w:ascii="Times New Roman" w:hAnsi="Times New Roman" w:cs="Times New Roman"/>
           <w:lang w:val="en-GB"/>
         </w:rPr>
-        <w:t xml:space="preserve">The thermal flow meter was developed at ENEA in collaboration with </w:t>
-      </w:r>
-      <w:proofErr w:type="spellStart"/>
-      <w:r>
-        <w:rPr>
-          <w:rFonts w:ascii="Times New Roman" w:hAnsi="Times New Roman" w:cs="Times New Roman"/>
-          <w:lang w:val="en-GB"/>
-        </w:rPr>
-        <w:t>Thermocoax</w:t>
-      </w:r>
-      <w:proofErr w:type="spellEnd"/>
-      <w:r>
-        <w:rPr>
-          <w:rFonts w:ascii="Times New Roman" w:hAnsi="Times New Roman" w:cs="Times New Roman"/>
-          <w:lang w:val="en-GB"/>
-        </w:rPr>
-        <w:t xml:space="preserve"> and was successfully tested first in water and subsequently in heavy liquid metal (HLM) during several experimental campaigns conducted in the NACIE facility. Compared with alternative measurement technologies, it offers the advantages of very </w:t>
-      </w:r>
-      <w:proofErr w:type="gramStart"/>
-      <w:r>
-        <w:rPr>
-          <w:rFonts w:ascii="Times New Roman" w:hAnsi="Times New Roman" w:cs="Times New Roman"/>
-          <w:lang w:val="en-GB"/>
-        </w:rPr>
-        <w:t>low pressure</w:t>
-      </w:r>
-      <w:proofErr w:type="gramEnd"/>
-      <w:r>
-        <w:rPr>
-          <w:rFonts w:ascii="Times New Roman" w:hAnsi="Times New Roman" w:cs="Times New Roman"/>
-          <w:lang w:val="en-GB"/>
-        </w:rPr>
-        <w:t xml:space="preserve"> losses and a very high maximum operating temperature. The instrument provides reliable measurements even at low HLM mass flow rates, down to 0.6 kg/s. The thermal flow meter operating according to a “thermal balance” principle demonstrated good stability and repeatability, a </w:t>
-      </w:r>
-      <w:proofErr w:type="spellStart"/>
-      <w:r>
-        <w:rPr>
-          <w:rFonts w:ascii="Times New Roman" w:hAnsi="Times New Roman" w:cs="Times New Roman"/>
-          <w:lang w:val="en-GB"/>
-        </w:rPr>
-        <w:t>favorable</w:t>
-      </w:r>
-      <w:proofErr w:type="spellEnd"/>
-      <w:r>
-        <w:rPr>
-          <w:rFonts w:ascii="Times New Roman" w:hAnsi="Times New Roman" w:cs="Times New Roman"/>
-          <w:lang w:val="en-GB"/>
-        </w:rPr>
-        <w:t xml:space="preserve"> response to transient conditions, and no requirement for calibration, as it relies on fundamental conservation laws.</w:t>
+        <w:t>The thermal flow meter was developed at ENEA in collaboration with Thermocoax and was successfully tested first in water and subsequently in heavy liquid metal (HLM) during several experimental campaigns conducted in the NACIE facility. Compared with alternative measurement technologies, it offers the advantages of very low pressure losses and a very high maximum operating temperature. The instrument provides reliable measurements even at low HLM mass flow rates, down to 0.6 kg/s. The thermal flow meter operating according to a “thermal balance” principle demonstrated good stability and repeatability, a favorable response to transient conditions, and no requirement for calibration, as it relies on fundamental conservation laws.</w:t>
       </w:r>
     </w:p>
     <w:p>
@@ -2494,25 +2356,7 @@
           <w:lang w:val="en-GB"/>
         </w:rPr>
         <w:lastRenderedPageBreak/>
-        <w:t xml:space="preserve">pin foot, a bottom grid is installed to maintain the structural integrity of the bundle, while the conical section allows elastic bending of the pins, which is required for the correct installation of the electrical connectors. A drawing of the bottom grid, which is the only component required for numerical fluid-dynamics </w:t>
-      </w:r>
-      <w:proofErr w:type="spellStart"/>
-      <w:r>
-        <w:rPr>
-          <w:rFonts w:asciiTheme="majorBidi" w:hAnsiTheme="majorBidi" w:cstheme="majorBidi"/>
-          <w:szCs w:val="24"/>
-          <w:lang w:val="en-GB"/>
-        </w:rPr>
-        <w:t>modeling</w:t>
-      </w:r>
-      <w:proofErr w:type="spellEnd"/>
-      <w:r>
-        <w:rPr>
-          <w:rFonts w:asciiTheme="majorBidi" w:hAnsiTheme="majorBidi" w:cstheme="majorBidi"/>
-          <w:szCs w:val="24"/>
-          <w:lang w:val="en-GB"/>
-        </w:rPr>
-        <w:t>, is provided separately to the participants.</w:t>
+        <w:t>pin foot, a bottom grid is installed to maintain the structural integrity of the bundle, while the conical section allows elastic bending of the pins, which is required for the correct installation of the electrical connectors. A drawing of the bottom grid, which is the only component required for numerical fluid-dynamics modeling, is provided separately to the participants.</w:t>
       </w:r>
     </w:p>
     <w:p>
@@ -2619,17 +2463,9 @@
         <w:rPr>
           <w:color w:val="auto"/>
         </w:rPr>
-        <w:t xml:space="preserve"> FPS design </w:t>
-      </w:r>
-      <w:proofErr w:type="spellStart"/>
-      <w:r>
-        <w:rPr>
-          <w:color w:val="auto"/>
-        </w:rPr>
-        <w:t>parameters</w:t>
+        <w:t xml:space="preserve"> FPS design parameters</w:t>
       </w:r>
       <w:bookmarkEnd w:id="12"/>
-      <w:proofErr w:type="spellEnd"/>
     </w:p>
     <w:tbl>
       <w:tblPr>
@@ -2661,7 +2497,6 @@
                 <w:iCs/>
               </w:rPr>
             </w:pPr>
-            <w:proofErr w:type="spellStart"/>
             <w:r>
               <w:rPr>
                 <w:b/>
@@ -2669,7 +2504,6 @@
               </w:rPr>
               <w:t>Parameter</w:t>
             </w:r>
-            <w:proofErr w:type="spellEnd"/>
           </w:p>
         </w:tc>
         <w:tc>
@@ -2871,7 +2705,6 @@
                 <w:bCs/>
               </w:rPr>
             </w:pPr>
-            <w:proofErr w:type="spellStart"/>
             <w:r>
               <w:t>d</w:t>
             </w:r>
@@ -2881,7 +2714,6 @@
               </w:rPr>
               <w:t>wire</w:t>
             </w:r>
-            <w:proofErr w:type="spellEnd"/>
           </w:p>
         </w:tc>
         <w:tc>
@@ -3500,7 +3332,7 @@
           <v:shape id="_x0000_i1027" type="#_x0000_t75" style="width:475.5pt;height:343.5pt" o:ole="">
             <v:imagedata r:id="rId16" o:title=""/>
           </v:shape>
-          <o:OLEObject Type="Embed" ProgID="Acrobat.Document.DC" ShapeID="_x0000_i1027" DrawAspect="Content" ObjectID="_1833778912" r:id="rId17"/>
+          <o:OLEObject Type="Embed" ProgID="Acrobat.Document.DC" ShapeID="_x0000_i1027" DrawAspect="Content" ObjectID="_1839043333" r:id="rId17"/>
         </w:object>
       </w:r>
     </w:p>
@@ -3602,25 +3434,7 @@
           <w:szCs w:val="24"/>
           <w:lang w:val="en-GB"/>
         </w:rPr>
-        <w:t xml:space="preserve">Pins No. 1, 2, 4, 5, 6, 7, 9, 16, 18, and 19 are instrumented with wall-embedded thermocouples located on one or more </w:t>
-      </w:r>
-      <w:proofErr w:type="spellStart"/>
-      <w:r>
-        <w:rPr>
-          <w:rFonts w:asciiTheme="majorBidi" w:hAnsiTheme="majorBidi" w:cstheme="majorBidi"/>
-          <w:szCs w:val="24"/>
-          <w:lang w:val="en-GB"/>
-        </w:rPr>
-        <w:t>generatrices</w:t>
-      </w:r>
-      <w:proofErr w:type="spellEnd"/>
-      <w:r>
-        <w:rPr>
-          <w:rFonts w:asciiTheme="majorBidi" w:hAnsiTheme="majorBidi" w:cstheme="majorBidi"/>
-          <w:szCs w:val="24"/>
-          <w:lang w:val="en-GB"/>
-        </w:rPr>
-        <w:t xml:space="preserve"> parallel to the pin axis, as summarized in </w:t>
+        <w:t xml:space="preserve">Pins No. 1, 2, 4, 5, 6, 7, 9, 16, 18, and 19 are instrumented with wall-embedded thermocouples located on one or more generatrices parallel to the pin axis, as summarized in </w:t>
       </w:r>
       <w:r>
         <w:rPr>
@@ -4084,25 +3898,7 @@
           <w:szCs w:val="24"/>
           <w:lang w:val="en-GB"/>
         </w:rPr>
-        <w:t xml:space="preserve"> (b). The relative positions of the grooves, i.e., the </w:t>
-      </w:r>
-      <w:proofErr w:type="spellStart"/>
-      <w:r>
-        <w:rPr>
-          <w:rFonts w:asciiTheme="majorBidi" w:hAnsiTheme="majorBidi" w:cstheme="majorBidi"/>
-          <w:szCs w:val="24"/>
-          <w:lang w:val="en-GB"/>
-        </w:rPr>
-        <w:t>generatrices</w:t>
-      </w:r>
-      <w:proofErr w:type="spellEnd"/>
-      <w:r>
-        <w:rPr>
-          <w:rFonts w:asciiTheme="majorBidi" w:hAnsiTheme="majorBidi" w:cstheme="majorBidi"/>
-          <w:szCs w:val="24"/>
-          <w:lang w:val="en-GB"/>
-        </w:rPr>
-        <w:t xml:space="preserve"> (highlighted in </w:t>
+        <w:t xml:space="preserve"> (b). The relative positions of the grooves, i.e., the generatrices (highlighted in </w:t>
       </w:r>
       <w:r>
         <w:rPr>
@@ -4216,26 +4012,16 @@
           <w:szCs w:val="24"/>
           <w:lang w:val="en-GB"/>
         </w:rPr>
-        <w:t xml:space="preserve">summarizes all the relevant information associated with the thermocouples, including the pin or wire number, thermocouple </w:t>
-      </w:r>
-      <w:proofErr w:type="gramStart"/>
+        <w:t xml:space="preserve">summarizes all the relevant information associated with the thermocouples, including the pin or wire number, thermocouple type </w:t>
+      </w:r>
       <w:r>
         <w:rPr>
           <w:rFonts w:asciiTheme="majorBidi" w:hAnsiTheme="majorBidi" w:cstheme="majorBidi"/>
           <w:szCs w:val="24"/>
-          <w:lang w:val="en-GB"/>
-        </w:rPr>
-        <w:t xml:space="preserve">type </w:t>
-      </w:r>
-      <w:r>
-        <w:rPr>
-          <w:rFonts w:asciiTheme="majorBidi" w:hAnsiTheme="majorBidi" w:cstheme="majorBidi"/>
-          <w:szCs w:val="24"/>
           <w:lang w:val="en-US"/>
         </w:rPr>
         <w:t>(‘</w:t>
       </w:r>
-      <w:proofErr w:type="gramEnd"/>
       <w:r>
         <w:rPr>
           <w:rFonts w:asciiTheme="majorBidi" w:eastAsia="Calibri" w:hAnsiTheme="majorBidi" w:cstheme="majorBidi"/>
@@ -4792,29 +4578,7 @@
           <w:szCs w:val="24"/>
           <w:lang w:val="en-US"/>
         </w:rPr>
-        <w:t xml:space="preserve">Azimuthal angles of the pin </w:t>
-      </w:r>
-      <w:proofErr w:type="spellStart"/>
-      <w:r>
-        <w:rPr>
-          <w:rFonts w:asciiTheme="majorBidi" w:eastAsia="MS Mincho" w:hAnsiTheme="majorBidi" w:cstheme="majorBidi"/>
-          <w:bCs w:val="0"/>
-          <w:color w:val="000000" w:themeColor="text1"/>
-          <w:szCs w:val="24"/>
-          <w:lang w:val="en-US"/>
-        </w:rPr>
-        <w:t>generatrices</w:t>
-      </w:r>
-      <w:proofErr w:type="spellEnd"/>
-      <w:r>
-        <w:rPr>
-          <w:rFonts w:asciiTheme="majorBidi" w:eastAsia="MS Mincho" w:hAnsiTheme="majorBidi" w:cstheme="majorBidi"/>
-          <w:bCs w:val="0"/>
-          <w:color w:val="000000" w:themeColor="text1"/>
-          <w:szCs w:val="24"/>
-          <w:lang w:val="en-US"/>
-        </w:rPr>
-        <w:t xml:space="preserve"> where the wall embedded Thermocouples are located.</w:t>
+        <w:t>Azimuthal angles of the pin generatrices where the wall embedded Thermocouples are located.</w:t>
       </w:r>
       <w:bookmarkEnd w:id="19"/>
     </w:p>
@@ -4865,224 +4629,129 @@
                 <w:b/>
                 <w:szCs w:val="24"/>
               </w:rPr>
-              <w:t xml:space="preserve">Pin </w:t>
-            </w:r>
-            <w:proofErr w:type="spellStart"/>
-            <w:r>
+              <w:t>Pin number</w:t>
+            </w:r>
+          </w:p>
+        </w:tc>
+        <w:tc>
+          <w:tcPr>
+            <w:tcW w:w="1601" w:type="dxa"/>
+          </w:tcPr>
+          <w:p>
+            <w:pPr>
+              <w:spacing w:before="100" w:beforeAutospacing="1" w:after="100" w:afterAutospacing="1"/>
+              <w:jc w:val="center"/>
               <w:rPr>
                 <w:rFonts w:eastAsia="Calibri"/>
                 <w:b/>
                 <w:szCs w:val="24"/>
               </w:rPr>
-              <w:t>number</w:t>
-            </w:r>
-            <w:proofErr w:type="spellEnd"/>
-          </w:p>
-        </w:tc>
-        <w:tc>
-          <w:tcPr>
-            <w:tcW w:w="1601" w:type="dxa"/>
-          </w:tcPr>
-          <w:p>
-            <w:pPr>
-              <w:spacing w:before="100" w:beforeAutospacing="1" w:after="100" w:afterAutospacing="1"/>
-              <w:jc w:val="center"/>
+            </w:pPr>
+            <w:r>
               <w:rPr>
                 <w:rFonts w:eastAsia="Calibri"/>
                 <w:b/>
                 <w:szCs w:val="24"/>
               </w:rPr>
-            </w:pPr>
-            <w:proofErr w:type="spellStart"/>
+              <w:t xml:space="preserve">Azimuthal angles </w:t>
+            </w:r>
             <w:r>
               <w:rPr>
                 <w:rFonts w:eastAsia="Calibri"/>
                 <w:b/>
                 <w:szCs w:val="24"/>
               </w:rPr>
-              <w:t>Azimuthal</w:t>
-            </w:r>
-            <w:proofErr w:type="spellEnd"/>
+              <w:sym w:font="Symbol" w:char="F04A"/>
+            </w:r>
             <w:r>
               <w:rPr>
                 <w:rFonts w:eastAsia="Calibri"/>
                 <w:b/>
                 <w:szCs w:val="24"/>
               </w:rPr>
-              <w:t xml:space="preserve"> </w:t>
-            </w:r>
-            <w:proofErr w:type="spellStart"/>
-            <w:r>
+              <w:t>[°]</w:t>
+            </w:r>
+          </w:p>
+        </w:tc>
+        <w:tc>
+          <w:tcPr>
+            <w:tcW w:w="4190" w:type="dxa"/>
+          </w:tcPr>
+          <w:p>
+            <w:pPr>
+              <w:spacing w:before="100" w:beforeAutospacing="1" w:after="100" w:afterAutospacing="1"/>
+              <w:jc w:val="center"/>
               <w:rPr>
                 <w:rFonts w:eastAsia="Calibri"/>
                 <w:b/>
                 <w:szCs w:val="24"/>
               </w:rPr>
-              <w:t>angles</w:t>
-            </w:r>
-            <w:proofErr w:type="spellEnd"/>
+            </w:pPr>
             <w:r>
               <w:rPr>
                 <w:rFonts w:eastAsia="Calibri"/>
                 <w:b/>
                 <w:szCs w:val="24"/>
               </w:rPr>
-              <w:t xml:space="preserve"> </w:t>
-            </w:r>
-            <w:r>
+              <w:t>Location [mm]</w:t>
+            </w:r>
+          </w:p>
+        </w:tc>
+        <w:tc>
+          <w:tcPr>
+            <w:tcW w:w="1115" w:type="dxa"/>
+          </w:tcPr>
+          <w:p>
+            <w:pPr>
+              <w:spacing w:before="100" w:beforeAutospacing="1" w:after="100" w:afterAutospacing="1"/>
+              <w:jc w:val="center"/>
               <w:rPr>
                 <w:rFonts w:eastAsia="Calibri"/>
                 <w:b/>
                 <w:szCs w:val="24"/>
               </w:rPr>
-              <w:sym w:font="Symbol" w:char="F04A"/>
-            </w:r>
+            </w:pPr>
             <w:r>
               <w:rPr>
                 <w:rFonts w:eastAsia="Calibri"/>
                 <w:b/>
                 <w:szCs w:val="24"/>
               </w:rPr>
-              <w:t>[°]</w:t>
-            </w:r>
-          </w:p>
-        </w:tc>
-        <w:tc>
-          <w:tcPr>
-            <w:tcW w:w="4190" w:type="dxa"/>
-          </w:tcPr>
-          <w:p>
-            <w:pPr>
-              <w:spacing w:before="100" w:beforeAutospacing="1" w:after="100" w:afterAutospacing="1"/>
-              <w:jc w:val="center"/>
+              <w:t xml:space="preserve">Number of </w:t>
+            </w:r>
+            <w:r>
               <w:rPr>
                 <w:rFonts w:eastAsia="Calibri"/>
                 <w:b/>
                 <w:szCs w:val="24"/>
               </w:rPr>
-            </w:pPr>
-            <w:proofErr w:type="gramStart"/>
-            <w:r>
+              <w:br/>
+              <w:t>wall TCs</w:t>
+            </w:r>
+          </w:p>
+        </w:tc>
+        <w:tc>
+          <w:tcPr>
+            <w:tcW w:w="1236" w:type="dxa"/>
+          </w:tcPr>
+          <w:p>
+            <w:pPr>
+              <w:spacing w:before="100" w:beforeAutospacing="1" w:after="100" w:afterAutospacing="1"/>
+              <w:jc w:val="center"/>
               <w:rPr>
                 <w:rFonts w:eastAsia="Calibri"/>
                 <w:b/>
                 <w:szCs w:val="24"/>
               </w:rPr>
-              <w:t>Location</w:t>
-            </w:r>
-            <w:proofErr w:type="gramEnd"/>
+            </w:pPr>
             <w:r>
               <w:rPr>
                 <w:rFonts w:eastAsia="Calibri"/>
                 <w:b/>
                 <w:szCs w:val="24"/>
               </w:rPr>
-              <w:t xml:space="preserve"> [mm]</w:t>
-            </w:r>
-          </w:p>
-        </w:tc>
-        <w:tc>
-          <w:tcPr>
-            <w:tcW w:w="1115" w:type="dxa"/>
-          </w:tcPr>
-          <w:p>
-            <w:pPr>
-              <w:spacing w:before="100" w:beforeAutospacing="1" w:after="100" w:afterAutospacing="1"/>
-              <w:jc w:val="center"/>
-              <w:rPr>
-                <w:rFonts w:eastAsia="Calibri"/>
-                <w:b/>
-                <w:szCs w:val="24"/>
-              </w:rPr>
-            </w:pPr>
-            <w:proofErr w:type="spellStart"/>
-            <w:r>
-              <w:rPr>
-                <w:rFonts w:eastAsia="Calibri"/>
-                <w:b/>
-                <w:szCs w:val="24"/>
-              </w:rPr>
-              <w:t>Number</w:t>
-            </w:r>
-            <w:proofErr w:type="spellEnd"/>
-            <w:r>
-              <w:rPr>
-                <w:rFonts w:eastAsia="Calibri"/>
-                <w:b/>
-                <w:szCs w:val="24"/>
-              </w:rPr>
-              <w:t xml:space="preserve"> of </w:t>
-            </w:r>
-            <w:r>
-              <w:rPr>
-                <w:rFonts w:eastAsia="Calibri"/>
-                <w:b/>
-                <w:szCs w:val="24"/>
-              </w:rPr>
-              <w:br/>
-            </w:r>
-            <w:proofErr w:type="spellStart"/>
-            <w:r>
-              <w:rPr>
-                <w:rFonts w:eastAsia="Calibri"/>
-                <w:b/>
-                <w:szCs w:val="24"/>
-              </w:rPr>
-              <w:t>wall</w:t>
-            </w:r>
-            <w:proofErr w:type="spellEnd"/>
-            <w:r>
-              <w:rPr>
-                <w:rFonts w:eastAsia="Calibri"/>
-                <w:b/>
-                <w:szCs w:val="24"/>
-              </w:rPr>
-              <w:t xml:space="preserve"> </w:t>
-            </w:r>
-            <w:proofErr w:type="spellStart"/>
-            <w:r>
-              <w:rPr>
-                <w:rFonts w:eastAsia="Calibri"/>
-                <w:b/>
-                <w:szCs w:val="24"/>
-              </w:rPr>
-              <w:t>TCs</w:t>
-            </w:r>
-            <w:proofErr w:type="spellEnd"/>
-          </w:p>
-        </w:tc>
-        <w:tc>
-          <w:tcPr>
-            <w:tcW w:w="1236" w:type="dxa"/>
-          </w:tcPr>
-          <w:p>
-            <w:pPr>
-              <w:spacing w:before="100" w:beforeAutospacing="1" w:after="100" w:afterAutospacing="1"/>
-              <w:jc w:val="center"/>
-              <w:rPr>
-                <w:rFonts w:eastAsia="Calibri"/>
-                <w:b/>
-                <w:szCs w:val="24"/>
-              </w:rPr>
-            </w:pPr>
-            <w:r>
-              <w:rPr>
-                <w:rFonts w:eastAsia="Calibri"/>
-                <w:b/>
-                <w:szCs w:val="24"/>
-              </w:rPr>
-              <w:t xml:space="preserve">TC </w:t>
-            </w:r>
-            <w:proofErr w:type="spellStart"/>
-            <w:r>
-              <w:rPr>
-                <w:rFonts w:eastAsia="Calibri"/>
-                <w:b/>
-                <w:szCs w:val="24"/>
-              </w:rPr>
-              <w:t>diameter</w:t>
-            </w:r>
-            <w:proofErr w:type="spellEnd"/>
+              <w:t>TC diameter</w:t>
+            </w:r>
             <w:r>
               <w:rPr>
                 <w:rFonts w:eastAsia="Calibri"/>
@@ -5488,23 +5157,7 @@
                 <w:rFonts w:eastAsia="Calibri"/>
                 <w:szCs w:val="24"/>
               </w:rPr>
-              <w:t>-120,</w:t>
-            </w:r>
-            <w:proofErr w:type="gramStart"/>
-            <w:r>
-              <w:rPr>
-                <w:rFonts w:eastAsia="Calibri"/>
-                <w:szCs w:val="24"/>
-              </w:rPr>
-              <w:t>0,+</w:t>
-            </w:r>
-            <w:proofErr w:type="gramEnd"/>
-            <w:r>
-              <w:rPr>
-                <w:rFonts w:eastAsia="Calibri"/>
-                <w:szCs w:val="24"/>
-              </w:rPr>
-              <w:t>120</w:t>
+              <w:t>-120,0,+120</w:t>
             </w:r>
           </w:p>
         </w:tc>
@@ -6409,51 +6062,7 @@
           <w:szCs w:val="24"/>
           <w:lang w:val="en-US"/>
         </w:rPr>
-        <w:t xml:space="preserve">Azimuthal angles of the </w:t>
-      </w:r>
-      <w:proofErr w:type="spellStart"/>
-      <w:r>
-        <w:rPr>
-          <w:rFonts w:asciiTheme="majorBidi" w:hAnsiTheme="majorBidi" w:cstheme="majorBidi"/>
-          <w:bCs w:val="0"/>
-          <w:color w:val="auto"/>
-          <w:szCs w:val="24"/>
-          <w:lang w:val="en-US"/>
-        </w:rPr>
-        <w:t>generatrices</w:t>
-      </w:r>
-      <w:proofErr w:type="spellEnd"/>
-      <w:r>
-        <w:rPr>
-          <w:rFonts w:asciiTheme="majorBidi" w:hAnsiTheme="majorBidi" w:cstheme="majorBidi"/>
-          <w:bCs w:val="0"/>
-          <w:color w:val="auto"/>
-          <w:szCs w:val="24"/>
-          <w:lang w:val="en-US"/>
-        </w:rPr>
-        <w:t xml:space="preserve"> where the bulk Thermocouples are located for each sub-channel </w:t>
-      </w:r>
-      <w:proofErr w:type="gramStart"/>
-      <w:r>
-        <w:rPr>
-          <w:rFonts w:asciiTheme="majorBidi" w:hAnsiTheme="majorBidi" w:cstheme="majorBidi"/>
-          <w:bCs w:val="0"/>
-          <w:color w:val="auto"/>
-          <w:szCs w:val="24"/>
-          <w:lang w:val="en-US"/>
-        </w:rPr>
-        <w:t>instrumented</w:t>
-      </w:r>
-      <w:proofErr w:type="gramEnd"/>
-      <w:r>
-        <w:rPr>
-          <w:rFonts w:asciiTheme="majorBidi" w:hAnsiTheme="majorBidi" w:cstheme="majorBidi"/>
-          <w:bCs w:val="0"/>
-          <w:color w:val="auto"/>
-          <w:szCs w:val="24"/>
-          <w:lang w:val="en-US"/>
-        </w:rPr>
-        <w:t>.</w:t>
+        <w:t>Azimuthal angles of the generatrices where the bulk Thermocouples are located for each sub-channel instrumented.</w:t>
       </w:r>
       <w:bookmarkEnd w:id="21"/>
     </w:p>
@@ -6504,41 +6113,46 @@
                 <w:b/>
                 <w:szCs w:val="24"/>
               </w:rPr>
-              <w:t>Sub-</w:t>
-            </w:r>
-            <w:proofErr w:type="spellStart"/>
+              <w:t>Sub-channel</w:t>
+            </w:r>
             <w:r>
               <w:rPr>
                 <w:rFonts w:eastAsia="Calibri"/>
                 <w:b/>
                 <w:szCs w:val="24"/>
               </w:rPr>
-              <w:t>channel</w:t>
-            </w:r>
-            <w:proofErr w:type="spellEnd"/>
-            <w:r>
+              <w:br/>
+              <w:t>number</w:t>
+            </w:r>
+          </w:p>
+        </w:tc>
+        <w:tc>
+          <w:tcPr>
+            <w:tcW w:w="1134" w:type="dxa"/>
+          </w:tcPr>
+          <w:p>
+            <w:pPr>
+              <w:spacing w:before="100" w:beforeAutospacing="1" w:after="100" w:afterAutospacing="1"/>
+              <w:jc w:val="center"/>
               <w:rPr>
                 <w:rFonts w:eastAsia="Calibri"/>
                 <w:b/>
                 <w:szCs w:val="24"/>
               </w:rPr>
-              <w:br/>
-            </w:r>
-            <w:proofErr w:type="spellStart"/>
+            </w:pPr>
             <w:r>
               <w:rPr>
                 <w:rFonts w:eastAsia="Calibri"/>
                 <w:b/>
                 <w:szCs w:val="24"/>
               </w:rPr>
-              <w:t>number</w:t>
-            </w:r>
-            <w:proofErr w:type="spellEnd"/>
-          </w:p>
-        </w:tc>
-        <w:tc>
-          <w:tcPr>
-            <w:tcW w:w="1134" w:type="dxa"/>
+              <w:t>Pin (wire) number</w:t>
+            </w:r>
+          </w:p>
+        </w:tc>
+        <w:tc>
+          <w:tcPr>
+            <w:tcW w:w="1843" w:type="dxa"/>
           </w:tcPr>
           <w:p>
             <w:pPr>
@@ -6556,69 +6170,71 @@
                 <w:b/>
                 <w:szCs w:val="24"/>
               </w:rPr>
-              <w:t>Pin (</w:t>
-            </w:r>
-            <w:proofErr w:type="spellStart"/>
+              <w:t xml:space="preserve">Azimuthal angle </w:t>
+            </w:r>
             <w:r>
               <w:rPr>
                 <w:rFonts w:eastAsia="Calibri"/>
                 <w:b/>
                 <w:szCs w:val="24"/>
               </w:rPr>
-              <w:t>wire</w:t>
-            </w:r>
-            <w:proofErr w:type="spellEnd"/>
+              <w:sym w:font="Symbol" w:char="F04A"/>
+            </w:r>
             <w:r>
               <w:rPr>
                 <w:rFonts w:eastAsia="Calibri"/>
                 <w:b/>
                 <w:szCs w:val="24"/>
               </w:rPr>
-              <w:t xml:space="preserve">) </w:t>
-            </w:r>
-            <w:proofErr w:type="spellStart"/>
-            <w:r>
+              <w:t>[°]</w:t>
+            </w:r>
+          </w:p>
+        </w:tc>
+        <w:tc>
+          <w:tcPr>
+            <w:tcW w:w="1985" w:type="dxa"/>
+          </w:tcPr>
+          <w:p>
+            <w:pPr>
+              <w:spacing w:before="100" w:beforeAutospacing="1" w:after="100" w:afterAutospacing="1"/>
+              <w:jc w:val="center"/>
               <w:rPr>
                 <w:rFonts w:eastAsia="Calibri"/>
                 <w:b/>
                 <w:szCs w:val="24"/>
               </w:rPr>
-              <w:t>number</w:t>
-            </w:r>
-            <w:proofErr w:type="spellEnd"/>
-          </w:p>
-        </w:tc>
-        <w:tc>
-          <w:tcPr>
-            <w:tcW w:w="1843" w:type="dxa"/>
-          </w:tcPr>
-          <w:p>
-            <w:pPr>
-              <w:spacing w:before="100" w:beforeAutospacing="1" w:after="100" w:afterAutospacing="1"/>
-              <w:jc w:val="center"/>
+            </w:pPr>
+            <w:r>
               <w:rPr>
                 <w:rFonts w:eastAsia="Calibri"/>
                 <w:b/>
                 <w:szCs w:val="24"/>
               </w:rPr>
-            </w:pPr>
-            <w:proofErr w:type="spellStart"/>
-            <w:r>
+              <w:t>Location [mm]</w:t>
+            </w:r>
+          </w:p>
+        </w:tc>
+        <w:tc>
+          <w:tcPr>
+            <w:tcW w:w="1559" w:type="dxa"/>
+          </w:tcPr>
+          <w:p>
+            <w:pPr>
+              <w:spacing w:before="100" w:beforeAutospacing="1" w:after="100" w:afterAutospacing="1"/>
+              <w:jc w:val="center"/>
               <w:rPr>
                 <w:rFonts w:eastAsia="Calibri"/>
                 <w:b/>
                 <w:szCs w:val="24"/>
               </w:rPr>
-              <w:t>Azimuthal</w:t>
-            </w:r>
-            <w:proofErr w:type="spellEnd"/>
+            </w:pPr>
             <w:r>
               <w:rPr>
                 <w:rFonts w:eastAsia="Calibri"/>
                 <w:b/>
                 <w:szCs w:val="24"/>
               </w:rPr>
-              <w:t xml:space="preserve"> angle </w:t>
+              <w:t xml:space="preserve">Number of </w:t>
             </w:r>
             <w:r>
               <w:rPr>
@@ -6626,135 +6242,42 @@
                 <w:b/>
                 <w:szCs w:val="24"/>
               </w:rPr>
-              <w:sym w:font="Symbol" w:char="F04A"/>
-            </w:r>
-            <w:r>
+              <w:br/>
+              <w:t>bulk TCs</w:t>
+            </w:r>
+          </w:p>
+        </w:tc>
+        <w:tc>
+          <w:tcPr>
+            <w:tcW w:w="1234" w:type="dxa"/>
+          </w:tcPr>
+          <w:p>
+            <w:pPr>
+              <w:spacing w:before="100" w:beforeAutospacing="1" w:after="100" w:afterAutospacing="1"/>
+              <w:jc w:val="center"/>
               <w:rPr>
                 <w:rFonts w:eastAsia="Calibri"/>
                 <w:b/>
                 <w:szCs w:val="24"/>
               </w:rPr>
-              <w:t>[°]</w:t>
-            </w:r>
-          </w:p>
-        </w:tc>
-        <w:tc>
-          <w:tcPr>
-            <w:tcW w:w="1985" w:type="dxa"/>
-          </w:tcPr>
-          <w:p>
-            <w:pPr>
-              <w:spacing w:before="100" w:beforeAutospacing="1" w:after="100" w:afterAutospacing="1"/>
-              <w:jc w:val="center"/>
+            </w:pPr>
+            <w:r>
               <w:rPr>
                 <w:rFonts w:eastAsia="Calibri"/>
                 <w:b/>
                 <w:szCs w:val="24"/>
               </w:rPr>
-            </w:pPr>
-            <w:proofErr w:type="gramStart"/>
+              <w:t>TC</w:t>
+            </w:r>
             <w:r>
               <w:rPr>
                 <w:rFonts w:eastAsia="Calibri"/>
                 <w:b/>
                 <w:szCs w:val="24"/>
               </w:rPr>
-              <w:t>Location</w:t>
-            </w:r>
-            <w:proofErr w:type="gramEnd"/>
-            <w:r>
-              <w:rPr>
-                <w:rFonts w:eastAsia="Calibri"/>
-                <w:b/>
-                <w:szCs w:val="24"/>
-              </w:rPr>
-              <w:t xml:space="preserve"> [mm]</w:t>
-            </w:r>
-          </w:p>
-        </w:tc>
-        <w:tc>
-          <w:tcPr>
-            <w:tcW w:w="1559" w:type="dxa"/>
-          </w:tcPr>
-          <w:p>
-            <w:pPr>
-              <w:spacing w:before="100" w:beforeAutospacing="1" w:after="100" w:afterAutospacing="1"/>
-              <w:jc w:val="center"/>
-              <w:rPr>
-                <w:rFonts w:eastAsia="Calibri"/>
-                <w:b/>
-                <w:szCs w:val="24"/>
-              </w:rPr>
-            </w:pPr>
-            <w:r>
-              <w:rPr>
-                <w:rFonts w:eastAsia="Calibri"/>
-                <w:b/>
-                <w:szCs w:val="24"/>
-              </w:rPr>
-              <w:t xml:space="preserve">Number of </w:t>
-            </w:r>
-            <w:r>
-              <w:rPr>
-                <w:rFonts w:eastAsia="Calibri"/>
-                <w:b/>
-                <w:szCs w:val="24"/>
-              </w:rPr>
               <w:br/>
-              <w:t xml:space="preserve">bulk </w:t>
-            </w:r>
-            <w:proofErr w:type="spellStart"/>
-            <w:r>
-              <w:rPr>
-                <w:rFonts w:eastAsia="Calibri"/>
-                <w:b/>
-                <w:szCs w:val="24"/>
-              </w:rPr>
-              <w:t>TCs</w:t>
-            </w:r>
-            <w:proofErr w:type="spellEnd"/>
-          </w:p>
-        </w:tc>
-        <w:tc>
-          <w:tcPr>
-            <w:tcW w:w="1234" w:type="dxa"/>
-          </w:tcPr>
-          <w:p>
-            <w:pPr>
-              <w:spacing w:before="100" w:beforeAutospacing="1" w:after="100" w:afterAutospacing="1"/>
-              <w:jc w:val="center"/>
-              <w:rPr>
-                <w:rFonts w:eastAsia="Calibri"/>
-                <w:b/>
-                <w:szCs w:val="24"/>
-              </w:rPr>
-            </w:pPr>
-            <w:r>
-              <w:rPr>
-                <w:rFonts w:eastAsia="Calibri"/>
-                <w:b/>
-                <w:szCs w:val="24"/>
-              </w:rPr>
-              <w:t>TC</w:t>
-            </w:r>
-            <w:r>
-              <w:rPr>
-                <w:rFonts w:eastAsia="Calibri"/>
-                <w:b/>
-                <w:szCs w:val="24"/>
-              </w:rPr>
-              <w:br/>
-            </w:r>
-            <w:proofErr w:type="spellStart"/>
-            <w:r>
-              <w:rPr>
-                <w:rFonts w:eastAsia="Calibri"/>
-                <w:b/>
-                <w:szCs w:val="24"/>
-              </w:rPr>
               <w:t>diameter</w:t>
             </w:r>
-            <w:proofErr w:type="spellEnd"/>
             <w:r>
               <w:rPr>
                 <w:rFonts w:eastAsia="Calibri"/>
@@ -7684,94 +7207,59 @@
                 <w:rFonts w:asciiTheme="majorBidi" w:eastAsia="Calibri" w:hAnsiTheme="majorBidi" w:cstheme="majorBidi"/>
                 <w:b/>
               </w:rPr>
-              <w:t>Pin (</w:t>
-            </w:r>
-            <w:proofErr w:type="spellStart"/>
-            <w:r>
+              <w:t>Pin (wire) number</w:t>
+            </w:r>
+          </w:p>
+        </w:tc>
+        <w:tc>
+          <w:tcPr>
+            <w:tcW w:w="1084" w:type="dxa"/>
+          </w:tcPr>
+          <w:p>
+            <w:pPr>
+              <w:spacing w:before="100" w:beforeAutospacing="1" w:after="100" w:afterAutospacing="1"/>
+              <w:jc w:val="center"/>
               <w:rPr>
                 <w:rFonts w:asciiTheme="majorBidi" w:eastAsia="Calibri" w:hAnsiTheme="majorBidi" w:cstheme="majorBidi"/>
                 <w:b/>
               </w:rPr>
-              <w:t>wire</w:t>
-            </w:r>
-            <w:proofErr w:type="spellEnd"/>
+            </w:pPr>
             <w:r>
               <w:rPr>
                 <w:rFonts w:asciiTheme="majorBidi" w:eastAsia="Calibri" w:hAnsiTheme="majorBidi" w:cstheme="majorBidi"/>
                 <w:b/>
               </w:rPr>
-              <w:t xml:space="preserve">) </w:t>
-            </w:r>
-            <w:proofErr w:type="spellStart"/>
-            <w:r>
+              <w:t>type</w:t>
+            </w:r>
+          </w:p>
+        </w:tc>
+        <w:tc>
+          <w:tcPr>
+            <w:tcW w:w="1134" w:type="dxa"/>
+          </w:tcPr>
+          <w:p>
+            <w:pPr>
+              <w:jc w:val="center"/>
               <w:rPr>
                 <w:rFonts w:asciiTheme="majorBidi" w:eastAsia="Calibri" w:hAnsiTheme="majorBidi" w:cstheme="majorBidi"/>
                 <w:b/>
               </w:rPr>
-              <w:t>number</w:t>
-            </w:r>
-            <w:proofErr w:type="spellEnd"/>
-          </w:p>
-        </w:tc>
-        <w:tc>
-          <w:tcPr>
-            <w:tcW w:w="1084" w:type="dxa"/>
-          </w:tcPr>
-          <w:p>
-            <w:pPr>
-              <w:spacing w:before="100" w:beforeAutospacing="1" w:after="100" w:afterAutospacing="1"/>
-              <w:jc w:val="center"/>
+            </w:pPr>
+            <w:r>
               <w:rPr>
                 <w:rFonts w:asciiTheme="majorBidi" w:eastAsia="Calibri" w:hAnsiTheme="majorBidi" w:cstheme="majorBidi"/>
                 <w:b/>
               </w:rPr>
-            </w:pPr>
-            <w:proofErr w:type="spellStart"/>
+              <w:t xml:space="preserve">TC </w:t>
+            </w:r>
             <w:r>
               <w:rPr>
                 <w:rFonts w:asciiTheme="majorBidi" w:eastAsia="Calibri" w:hAnsiTheme="majorBidi" w:cstheme="majorBidi"/>
                 <w:b/>
               </w:rPr>
-              <w:t>type</w:t>
-            </w:r>
-            <w:proofErr w:type="spellEnd"/>
-          </w:p>
-        </w:tc>
-        <w:tc>
-          <w:tcPr>
-            <w:tcW w:w="1134" w:type="dxa"/>
-          </w:tcPr>
-          <w:p>
-            <w:pPr>
-              <w:jc w:val="center"/>
-              <w:rPr>
-                <w:rFonts w:asciiTheme="majorBidi" w:eastAsia="Calibri" w:hAnsiTheme="majorBidi" w:cstheme="majorBidi"/>
-                <w:b/>
-              </w:rPr>
-            </w:pPr>
-            <w:r>
-              <w:rPr>
-                <w:rFonts w:asciiTheme="majorBidi" w:eastAsia="Calibri" w:hAnsiTheme="majorBidi" w:cstheme="majorBidi"/>
-                <w:b/>
-              </w:rPr>
-              <w:t xml:space="preserve">TC </w:t>
-            </w:r>
-            <w:r>
-              <w:rPr>
-                <w:rFonts w:asciiTheme="majorBidi" w:eastAsia="Calibri" w:hAnsiTheme="majorBidi" w:cstheme="majorBidi"/>
-                <w:b/>
-              </w:rPr>
               <w:br/>
-            </w:r>
-            <w:proofErr w:type="spellStart"/>
-            <w:r>
-              <w:rPr>
-                <w:rFonts w:asciiTheme="majorBidi" w:eastAsia="Calibri" w:hAnsiTheme="majorBidi" w:cstheme="majorBidi"/>
-                <w:b/>
-              </w:rPr>
               <w:t>diameter</w:t>
             </w:r>
-            <w:proofErr w:type="spellEnd"/>
             <w:r>
               <w:rPr>
                 <w:rFonts w:asciiTheme="majorBidi" w:eastAsia="Calibri" w:hAnsiTheme="majorBidi" w:cstheme="majorBidi"/>
@@ -7810,7 +7298,6 @@
                 <w:b/>
               </w:rPr>
             </w:pPr>
-            <w:proofErr w:type="spellStart"/>
             <w:r>
               <w:rPr>
                 <w:rFonts w:asciiTheme="majorBidi" w:eastAsia="Calibri" w:hAnsiTheme="majorBidi" w:cstheme="majorBidi"/>
@@ -7818,23 +7305,14 @@
               </w:rPr>
               <w:t>Subchannel</w:t>
             </w:r>
-            <w:proofErr w:type="spellEnd"/>
             <w:r>
               <w:rPr>
                 <w:rFonts w:asciiTheme="majorBidi" w:eastAsia="Calibri" w:hAnsiTheme="majorBidi" w:cstheme="majorBidi"/>
                 <w:b/>
               </w:rPr>
               <w:br/>
-            </w:r>
-            <w:proofErr w:type="spellStart"/>
-            <w:r>
-              <w:rPr>
-                <w:rFonts w:asciiTheme="majorBidi" w:eastAsia="Calibri" w:hAnsiTheme="majorBidi" w:cstheme="majorBidi"/>
-                <w:b/>
-              </w:rPr>
               <w:t>number</w:t>
             </w:r>
-            <w:proofErr w:type="spellEnd"/>
             <w:r>
               <w:rPr>
                 <w:rFonts w:asciiTheme="majorBidi" w:eastAsia="Calibri" w:hAnsiTheme="majorBidi" w:cstheme="majorBidi"/>
@@ -7858,21 +7336,12 @@
                 <w:b/>
               </w:rPr>
             </w:pPr>
-            <w:proofErr w:type="spellStart"/>
             <w:r>
               <w:rPr>
                 <w:rFonts w:asciiTheme="majorBidi" w:eastAsia="Calibri" w:hAnsiTheme="majorBidi" w:cstheme="majorBidi"/>
                 <w:b/>
               </w:rPr>
-              <w:t>Azimuthal</w:t>
-            </w:r>
-            <w:proofErr w:type="spellEnd"/>
-            <w:r>
-              <w:rPr>
-                <w:rFonts w:asciiTheme="majorBidi" w:eastAsia="Calibri" w:hAnsiTheme="majorBidi" w:cstheme="majorBidi"/>
-                <w:b/>
-              </w:rPr>
-              <w:t xml:space="preserve"> </w:t>
+              <w:t xml:space="preserve">Azimuthal </w:t>
             </w:r>
             <w:r>
               <w:rPr>
@@ -7888,23 +7357,7 @@
                 <w:b/>
               </w:rPr>
               <w:br/>
-              <w:t>(</w:t>
-            </w:r>
-            <w:proofErr w:type="spellStart"/>
-            <w:r>
-              <w:rPr>
-                <w:rFonts w:asciiTheme="majorBidi" w:eastAsia="Calibri" w:hAnsiTheme="majorBidi" w:cstheme="majorBidi"/>
-                <w:b/>
-              </w:rPr>
-              <w:t>wall</w:t>
-            </w:r>
-            <w:proofErr w:type="spellEnd"/>
-            <w:r>
-              <w:rPr>
-                <w:rFonts w:asciiTheme="majorBidi" w:eastAsia="Calibri" w:hAnsiTheme="majorBidi" w:cstheme="majorBidi"/>
-                <w:b/>
-              </w:rPr>
-              <w:t xml:space="preserve"> TC)</w:t>
+              <w:t>(wall TC)</w:t>
             </w:r>
           </w:p>
         </w:tc>
@@ -19546,27 +18999,7 @@
           <w:szCs w:val="24"/>
           <w:lang w:val="en-GB"/>
         </w:rPr>
-        <w:t xml:space="preserve">In the three experiments discussed in this report, only the high-power counter-current section of the heat exchanger is utilized. The counter-current flow arrangement simplifies the thermo-fluid-dynamic </w:t>
-      </w:r>
-      <w:proofErr w:type="spellStart"/>
-      <w:r>
-        <w:rPr>
-          <w:rFonts w:ascii="Times New Roman" w:hAnsi="Times New Roman" w:cs="Times New Roman"/>
-          <w:bCs/>
-          <w:szCs w:val="24"/>
-          <w:lang w:val="en-GB"/>
-        </w:rPr>
-        <w:t>modeling</w:t>
-      </w:r>
-      <w:proofErr w:type="spellEnd"/>
-      <w:r>
-        <w:rPr>
-          <w:rFonts w:ascii="Times New Roman" w:hAnsi="Times New Roman" w:cs="Times New Roman"/>
-          <w:bCs/>
-          <w:szCs w:val="24"/>
-          <w:lang w:val="en-GB"/>
-        </w:rPr>
-        <w:t xml:space="preserve"> of the heat exchanger.</w:t>
+        <w:t>In the three experiments discussed in this report, only the high-power counter-current section of the heat exchanger is utilized. The counter-current flow arrangement simplifies the thermo-fluid-dynamic modeling of the heat exchanger.</w:t>
       </w:r>
     </w:p>
     <w:p>
@@ -19621,25 +19054,7 @@
           <w:szCs w:val="24"/>
           <w:lang w:val="en-GB"/>
         </w:rPr>
-        <w:t xml:space="preserve">The heat exchanger features double walls filled with AISI stainless-steel powder; therefore, an accurate numerical </w:t>
-      </w:r>
-      <w:proofErr w:type="spellStart"/>
-      <w:r>
-        <w:rPr>
-          <w:rFonts w:asciiTheme="majorBidi" w:hAnsiTheme="majorBidi" w:cstheme="majorBidi"/>
-          <w:szCs w:val="24"/>
-          <w:lang w:val="en-GB"/>
-        </w:rPr>
-        <w:t>modeling</w:t>
-      </w:r>
-      <w:proofErr w:type="spellEnd"/>
-      <w:r>
-        <w:rPr>
-          <w:rFonts w:asciiTheme="majorBidi" w:hAnsiTheme="majorBidi" w:cstheme="majorBidi"/>
-          <w:szCs w:val="24"/>
-          <w:lang w:val="en-GB"/>
-        </w:rPr>
-        <w:t xml:space="preserve"> of the heat exchanger is essential to correctly predict the average LBE temperature in the loop under all the investigated operating conditions. A technical drawing of the heat exchanger is provided in </w:t>
+        <w:t xml:space="preserve">The heat exchanger features double walls filled with AISI stainless-steel powder; therefore, an accurate numerical modeling of the heat exchanger is essential to correctly predict the average LBE temperature in the loop under all the investigated operating conditions. A technical drawing of the heat exchanger is provided in </w:t>
       </w:r>
       <w:r>
         <w:rPr>
@@ -20185,25 +19600,7 @@
           <w:szCs w:val="24"/>
           <w:lang w:val="en-US"/>
         </w:rPr>
-        <w:t xml:space="preserve">In particular, the re-evaluation focused on the thermal conductivity of the stainless-steel powder filling the 2.45 mm gap. This contribution accounts for nearly 50% of the total thermal resistance of the HX and therefore has a major impact on </w:t>
-      </w:r>
-      <w:proofErr w:type="gramStart"/>
-      <w:r>
-        <w:rPr>
-          <w:rFonts w:ascii="Times New Roman" w:hAnsi="Times New Roman" w:cs="Times New Roman"/>
-          <w:szCs w:val="24"/>
-          <w:lang w:val="en-US"/>
-        </w:rPr>
-        <w:t>the global</w:t>
-      </w:r>
-      <w:proofErr w:type="gramEnd"/>
-      <w:r>
-        <w:rPr>
-          <w:rFonts w:ascii="Times New Roman" w:hAnsi="Times New Roman" w:cs="Times New Roman"/>
-          <w:szCs w:val="24"/>
-          <w:lang w:val="en-US"/>
-        </w:rPr>
-        <w:t xml:space="preserve"> heat-transfer performance and, ultimately, on the mean temperature of the loop.</w:t>
+        <w:t>In particular, the re-evaluation focused on the thermal conductivity of the stainless-steel powder filling the 2.45 mm gap. This contribution accounts for nearly 50% of the total thermal resistance of the HX and therefore has a major impact on the global heat-transfer performance and, ultimately, on the mean temperature of the loop.</w:t>
       </w:r>
     </w:p>
     <w:p>
@@ -20492,7 +19889,23 @@
           <w:szCs w:val="24"/>
           <w:lang w:val="en-GB"/>
         </w:rPr>
-        <w:t>allowed an analytical expression for the powder thermal conductivity to be derived, which is strongly recommended for adoption in the present benchmark:</w:t>
+        <w:t>allowed an analytical expression for the powder thermal conductivity to be derived, which is strongly recommended for adoption in the present benchmark</w:t>
+      </w:r>
+      <w:r>
+        <w:rPr>
+          <w:rFonts w:ascii="Times New Roman" w:hAnsi="Times New Roman" w:cs="Times New Roman"/>
+          <w:szCs w:val="24"/>
+          <w:lang w:val="en-GB"/>
+        </w:rPr>
+        <w:t>, Eq. (2)</w:t>
+      </w:r>
+      <w:r>
+        <w:rPr>
+          <w:rFonts w:ascii="Times New Roman" w:hAnsi="Times New Roman" w:cs="Times New Roman"/>
+          <w:szCs w:val="24"/>
+          <w:lang w:val="en-GB"/>
+        </w:rPr>
+        <w:t>:</w:t>
       </w:r>
     </w:p>
     <w:tbl>
@@ -20664,25 +20077,7 @@
           <w:szCs w:val="24"/>
           <w:lang w:val="en-GB"/>
         </w:rPr>
-        <w:t xml:space="preserve">This assumption is more consistent with the currently available experimental data and provides a more accurate representation of the HX thermal performance and, more generally, of the system </w:t>
-      </w:r>
-      <w:proofErr w:type="spellStart"/>
-      <w:r>
-        <w:rPr>
-          <w:rFonts w:ascii="Times New Roman" w:hAnsi="Times New Roman" w:cs="Times New Roman"/>
-          <w:szCs w:val="24"/>
-          <w:lang w:val="en-GB"/>
-        </w:rPr>
-        <w:t>behavior</w:t>
-      </w:r>
-      <w:proofErr w:type="spellEnd"/>
-      <w:r>
-        <w:rPr>
-          <w:rFonts w:ascii="Times New Roman" w:hAnsi="Times New Roman" w:cs="Times New Roman"/>
-          <w:szCs w:val="24"/>
-          <w:lang w:val="en-GB"/>
-        </w:rPr>
-        <w:t xml:space="preserve">. Regarding the assumptions on the HX geometrical parameters, such as heat-transfer surfaces and double-wall tube thicknesses, these were taken directly from the design drawings </w:t>
+        <w:t xml:space="preserve">This assumption is more consistent with the currently available experimental data and provides a more accurate representation of the HX thermal performance and, more generally, of the system behavior. Regarding the assumptions on the HX geometrical parameters, such as heat-transfer surfaces and double-wall tube thicknesses, these were taken directly from the design drawings </w:t>
       </w:r>
       <w:r>
         <w:rPr>
@@ -21583,23 +20978,13 @@
           <w:lang w:val="en-GB"/>
         </w:rPr>
       </w:pPr>
-      <w:proofErr w:type="gramStart"/>
       <w:r>
         <w:rPr>
           <w:rFonts w:asciiTheme="majorBidi" w:hAnsiTheme="majorBidi" w:cstheme="majorBidi"/>
           <w:szCs w:val="24"/>
           <w:lang w:val="en-GB"/>
         </w:rPr>
-        <w:t>With regard to</w:t>
-      </w:r>
-      <w:proofErr w:type="gramEnd"/>
-      <w:r>
-        <w:rPr>
-          <w:rFonts w:asciiTheme="majorBidi" w:hAnsiTheme="majorBidi" w:cstheme="majorBidi"/>
-          <w:szCs w:val="24"/>
-          <w:lang w:val="en-GB"/>
-        </w:rPr>
-        <w:t xml:space="preserve"> the gas injection system, the control unit allows the argon volumetric flow rate to be set. However, the resulting void fraction </w:t>
+        <w:t xml:space="preserve">With regard to the gas injection system, the control unit allows the argon volumetric flow rate to be set. However, the resulting void fraction </w:t>
       </w:r>
       <w:r>
         <w:rPr>
@@ -21639,25 +21024,7 @@
           <w:lang w:val="en-GB"/>
         </w:rPr>
         <w:lastRenderedPageBreak/>
-        <w:t xml:space="preserve">In addition, the gas injection system exhibits intrinsic operational limitations related to this non-linear </w:t>
-      </w:r>
-      <w:proofErr w:type="spellStart"/>
-      <w:r>
-        <w:rPr>
-          <w:rFonts w:asciiTheme="majorBidi" w:hAnsiTheme="majorBidi" w:cstheme="majorBidi"/>
-          <w:szCs w:val="24"/>
-          <w:lang w:val="en-GB"/>
-        </w:rPr>
-        <w:t>behavior</w:t>
-      </w:r>
-      <w:proofErr w:type="spellEnd"/>
-      <w:r>
-        <w:rPr>
-          <w:rFonts w:asciiTheme="majorBidi" w:hAnsiTheme="majorBidi" w:cstheme="majorBidi"/>
-          <w:szCs w:val="24"/>
-          <w:lang w:val="en-GB"/>
-        </w:rPr>
-        <w:t>. At high gas mass flow rates, the pumping capability approaches saturation, and the overall efficiency of the system decreases.</w:t>
+        <w:t>In addition, the gas injection system exhibits intrinsic operational limitations related to this non-linear behavior. At high gas mass flow rates, the pumping capability approaches saturation, and the overall efficiency of the system decreases.</w:t>
       </w:r>
     </w:p>
     <w:p>
@@ -23118,43 +22485,7 @@
           <w:color w:val="000000"/>
           <w:lang w:val="en-US" w:eastAsia="it-IT"/>
         </w:rPr>
-        <w:t xml:space="preserve">D. </w:t>
-      </w:r>
-      <w:proofErr w:type="spellStart"/>
-      <w:r>
-        <w:rPr>
-          <w:rFonts w:ascii="Times New Roman" w:eastAsia="Times New Roman" w:hAnsi="Times New Roman" w:cs="Times New Roman"/>
-          <w:color w:val="000000"/>
-          <w:lang w:val="en-US" w:eastAsia="it-IT"/>
-        </w:rPr>
-        <w:t>Rozzia</w:t>
-      </w:r>
-      <w:proofErr w:type="spellEnd"/>
-      <w:r>
-        <w:rPr>
-          <w:rFonts w:ascii="Times New Roman" w:eastAsia="Times New Roman" w:hAnsi="Times New Roman" w:cs="Times New Roman"/>
-          <w:color w:val="000000"/>
-          <w:lang w:val="en-US" w:eastAsia="it-IT"/>
-        </w:rPr>
-        <w:t>, G. Fasano, I. Di Piazza, M. Tarantino</w:t>
-      </w:r>
-      <w:proofErr w:type="gramStart"/>
-      <w:r>
-        <w:rPr>
-          <w:rFonts w:ascii="Times New Roman" w:eastAsia="Times New Roman" w:hAnsi="Times New Roman" w:cs="Times New Roman"/>
-          <w:color w:val="000000"/>
-          <w:lang w:val="en-US" w:eastAsia="it-IT"/>
-        </w:rPr>
-        <w:t>, ,</w:t>
-      </w:r>
-      <w:proofErr w:type="gramEnd"/>
-      <w:r>
-        <w:rPr>
-          <w:rFonts w:ascii="Times New Roman" w:eastAsia="Times New Roman" w:hAnsi="Times New Roman" w:cs="Times New Roman"/>
-          <w:color w:val="000000"/>
-          <w:lang w:val="en-US" w:eastAsia="it-IT"/>
-        </w:rPr>
-        <w:t xml:space="preserve"> “Experimental Investigation on Powder Conductivity for the Application to Double Wall Heat Exchanger (NACIE-UP)”, Journal of Nuclear Engineering and Design, vol.283, pp. 100-113, 2015</w:t>
+        <w:t>D. Rozzia, G. Fasano, I. Di Piazza, M. Tarantino, , “Experimental Investigation on Powder Conductivity for the Application to Double Wall Heat Exchanger (NACIE-UP)”, Journal of Nuclear Engineering and Design, vol.283, pp. 100-113, 2015</w:t>
       </w:r>
       <w:r>
         <w:rPr>
@@ -23198,23 +22529,7 @@
           <w:lang w:val="en-US"/>
         </w:rPr>
         <w:lastRenderedPageBreak/>
-        <w:t xml:space="preserve">N. Forgione, D. Martelli, G. Barone, F. Giannetti, P. Lorusso, T. Hollands, A. </w:t>
-      </w:r>
-      <w:proofErr w:type="spellStart"/>
-      <w:r>
-        <w:rPr>
-          <w:rFonts w:ascii="Times New Roman" w:eastAsia="Times New Roman" w:hAnsi="Times New Roman" w:cs="Times New Roman"/>
-          <w:lang w:val="en-US"/>
-        </w:rPr>
-        <w:t>Papukchiev</w:t>
-      </w:r>
-      <w:proofErr w:type="spellEnd"/>
-      <w:r>
-        <w:rPr>
-          <w:rFonts w:ascii="Times New Roman" w:eastAsia="Times New Roman" w:hAnsi="Times New Roman" w:cs="Times New Roman"/>
-          <w:lang w:val="en-US"/>
-        </w:rPr>
-        <w:t>, M. Polidori, A. Cervone, I. Di Piazza, “</w:t>
+        <w:t>N. Forgione, D. Martelli, G. Barone, F. Giannetti, P. Lorusso, T. Hollands, A. Papukchiev, M. Polidori, A. Cervone, I. Di Piazza, “</w:t>
       </w:r>
       <w:r>
         <w:rPr>
@@ -23269,80 +22584,20 @@
         </w:rPr>
       </w:pPr>
       <w:bookmarkStart w:id="48" w:name="_Ref64555840"/>
-      <w:proofErr w:type="spellStart"/>
-      <w:proofErr w:type="gramStart"/>
       <w:r>
         <w:rPr>
           <w:rFonts w:ascii="Times New Roman" w:eastAsia="Times New Roman" w:hAnsi="Times New Roman" w:cs="Times New Roman"/>
           <w:color w:val="000000"/>
           <w:lang w:val="en-US" w:eastAsia="it-IT"/>
         </w:rPr>
-        <w:t>N.Forgione</w:t>
-      </w:r>
-      <w:proofErr w:type="spellEnd"/>
-      <w:proofErr w:type="gramEnd"/>
-      <w:r>
-        <w:rPr>
-          <w:rFonts w:ascii="Times New Roman" w:eastAsia="Times New Roman" w:hAnsi="Times New Roman" w:cs="Times New Roman"/>
-          <w:color w:val="000000"/>
-          <w:lang w:val="en-US" w:eastAsia="it-IT"/>
-        </w:rPr>
-        <w:t>,</w:t>
+        <w:t>N.Forgione,</w:t>
       </w:r>
       <w:r>
         <w:rPr>
           <w:rFonts w:ascii="Times New Roman" w:eastAsia="Times New Roman" w:hAnsi="Times New Roman" w:cs="Times New Roman"/>
           <w:lang w:val="en-US" w:eastAsia="it-IT"/>
         </w:rPr>
-        <w:t xml:space="preserve"> </w:t>
-      </w:r>
-      <w:proofErr w:type="gramStart"/>
-      <w:r>
-        <w:rPr>
-          <w:rFonts w:ascii="Times New Roman" w:eastAsia="Times New Roman" w:hAnsi="Times New Roman" w:cs="Times New Roman"/>
-          <w:lang w:val="en-US" w:eastAsia="it-IT"/>
-        </w:rPr>
-        <w:t>“ Post</w:t>
-      </w:r>
-      <w:proofErr w:type="gramEnd"/>
-      <w:r>
-        <w:rPr>
-          <w:rFonts w:ascii="Times New Roman" w:eastAsia="Times New Roman" w:hAnsi="Times New Roman" w:cs="Times New Roman"/>
-          <w:lang w:val="en-US" w:eastAsia="it-IT"/>
-        </w:rPr>
-        <w:t xml:space="preserve"> Test Simulation for </w:t>
-      </w:r>
-      <w:proofErr w:type="gramStart"/>
-      <w:r>
-        <w:rPr>
-          <w:rFonts w:ascii="Times New Roman" w:eastAsia="Times New Roman" w:hAnsi="Times New Roman" w:cs="Times New Roman"/>
-          <w:lang w:val="en-US" w:eastAsia="it-IT"/>
-        </w:rPr>
-        <w:t>The</w:t>
-      </w:r>
-      <w:proofErr w:type="gramEnd"/>
-      <w:r>
-        <w:rPr>
-          <w:rFonts w:ascii="Times New Roman" w:eastAsia="Times New Roman" w:hAnsi="Times New Roman" w:cs="Times New Roman"/>
-          <w:lang w:val="en-US" w:eastAsia="it-IT"/>
-        </w:rPr>
-        <w:t xml:space="preserve"> NACIE-UP Benchmark </w:t>
-      </w:r>
-      <w:proofErr w:type="gramStart"/>
-      <w:r>
-        <w:rPr>
-          <w:rFonts w:ascii="Times New Roman" w:eastAsia="Times New Roman" w:hAnsi="Times New Roman" w:cs="Times New Roman"/>
-          <w:lang w:val="en-US" w:eastAsia="it-IT"/>
-        </w:rPr>
-        <w:t>By</w:t>
-      </w:r>
-      <w:proofErr w:type="gramEnd"/>
-      <w:r>
-        <w:rPr>
-          <w:rFonts w:ascii="Times New Roman" w:eastAsia="Times New Roman" w:hAnsi="Times New Roman" w:cs="Times New Roman"/>
-          <w:lang w:val="en-US" w:eastAsia="it-IT"/>
-        </w:rPr>
-        <w:t xml:space="preserve"> STH Codes”,2018</w:t>
+        <w:t xml:space="preserve"> “ Post Test Simulation for The NACIE-UP Benchmark By STH Codes”,2018</w:t>
       </w:r>
       <w:bookmarkEnd w:id="48"/>
     </w:p>
@@ -33689,16 +32944,6 @@
 </file>
 
 <file path=customXml/item2.xml><?xml version="1.0" encoding="utf-8"?>
-<b:Sources xmlns:b="http://schemas.openxmlformats.org/officeDocument/2006/bibliography" xmlns="http://schemas.openxmlformats.org/officeDocument/2006/bibliography" SelectedStyle="\APASixthEditionOfficeOnline.xsl" StyleName="APA" Version="6"/>
-</file>
-
-<file path=customXml/item3.xml><?xml version="1.0" encoding="utf-8"?>
-<p:properties xmlns:p="http://schemas.microsoft.com/office/2006/metadata/properties" xmlns:xsi="http://www.w3.org/2001/XMLSchema-instance" xmlns:pc="http://schemas.microsoft.com/office/infopath/2007/PartnerControls">
-  <documentManagement/>
-</p:properties>
-</file>
-
-<file path=customXml/item4.xml><?xml version="1.0" encoding="utf-8"?>
 <ct:contentTypeSchema xmlns:ct="http://schemas.microsoft.com/office/2006/metadata/contentType" xmlns:ma="http://schemas.microsoft.com/office/2006/metadata/properties/metaAttributes" ct:_="" ma:_="" ma:contentTypeName="Document" ma:contentTypeID="0x010100C38D9328E238A74E9F29FD7E721AEDAB" ma:contentTypeVersion="2" ma:contentTypeDescription="Create a new document." ma:contentTypeScope="" ma:versionID="39ae63eb142d3fe1709322933097f9a4">
   <xsd:schema xmlns:xsd="http://www.w3.org/2001/XMLSchema" xmlns:xs="http://www.w3.org/2001/XMLSchema" xmlns:p="http://schemas.microsoft.com/office/2006/metadata/properties" xmlns:ns2="7e2e151c-dac5-445b-bf96-82805ce2a2c8" targetNamespace="http://schemas.microsoft.com/office/2006/metadata/properties" ma:root="true" ma:fieldsID="39ed7929dde1372f6d17432a2c80d9b3" ns2:_="">
     <xsd:import namespace="7e2e151c-dac5-445b-bf96-82805ce2a2c8"/>
@@ -33846,6 +33091,16 @@
 </ct:contentTypeSchema>
 </file>
 
+<file path=customXml/item3.xml><?xml version="1.0" encoding="utf-8"?>
+<p:properties xmlns:p="http://schemas.microsoft.com/office/2006/metadata/properties" xmlns:xsi="http://www.w3.org/2001/XMLSchema-instance" xmlns:pc="http://schemas.microsoft.com/office/infopath/2007/PartnerControls">
+  <documentManagement/>
+</p:properties>
+</file>
+
+<file path=customXml/item4.xml><?xml version="1.0" encoding="utf-8"?>
+<b:Sources xmlns:b="http://schemas.openxmlformats.org/officeDocument/2006/bibliography" xmlns="http://schemas.openxmlformats.org/officeDocument/2006/bibliography" SelectedStyle="\APASixthEditionOfficeOnline.xsl" StyleName="APA" Version="6"/>
+</file>
+
 <file path=customXml/itemProps1.xml><?xml version="1.0" encoding="utf-8"?>
 <ds:datastoreItem xmlns:ds="http://schemas.openxmlformats.org/officeDocument/2006/customXml" ds:itemID="{5FDADFDA-6C84-45AF-8438-5EC981E806CC}">
   <ds:schemaRefs>
@@ -33855,23 +33110,6 @@
 </file>
 
 <file path=customXml/itemProps2.xml><?xml version="1.0" encoding="utf-8"?>
-<ds:datastoreItem xmlns:ds="http://schemas.openxmlformats.org/officeDocument/2006/customXml" ds:itemID="{4DA5F263-1105-4DFA-9226-3A9690489806}">
-  <ds:schemaRefs>
-    <ds:schemaRef ds:uri="http://schemas.openxmlformats.org/officeDocument/2006/bibliography"/>
-  </ds:schemaRefs>
-</ds:datastoreItem>
-</file>
-
-<file path=customXml/itemProps3.xml><?xml version="1.0" encoding="utf-8"?>
-<ds:datastoreItem xmlns:ds="http://schemas.openxmlformats.org/officeDocument/2006/customXml" ds:itemID="{601B184D-03E7-4735-8F80-8EB85079E962}">
-  <ds:schemaRefs>
-    <ds:schemaRef ds:uri="http://schemas.microsoft.com/office/2006/metadata/properties"/>
-    <ds:schemaRef ds:uri="http://schemas.microsoft.com/office/infopath/2007/PartnerControls"/>
-  </ds:schemaRefs>
-</ds:datastoreItem>
-</file>
-
-<file path=customXml/itemProps4.xml><?xml version="1.0" encoding="utf-8"?>
 <ds:datastoreItem xmlns:ds="http://schemas.openxmlformats.org/officeDocument/2006/customXml" ds:itemID="{6AE551BC-66FE-40E6-AA30-CB299AA97D2B}">
   <ds:schemaRefs>
     <ds:schemaRef ds:uri="http://schemas.microsoft.com/office/2006/metadata/contentType"/>
@@ -33887,4 +33125,21 @@
     <ds:schemaRef ds:uri="http://schemas.microsoft.com/internal/obd"/>
   </ds:schemaRefs>
 </ds:datastoreItem>
+</file>
+
+<file path=customXml/itemProps3.xml><?xml version="1.0" encoding="utf-8"?>
+<ds:datastoreItem xmlns:ds="http://schemas.openxmlformats.org/officeDocument/2006/customXml" ds:itemID="{601B184D-03E7-4735-8F80-8EB85079E962}">
+  <ds:schemaRefs>
+    <ds:schemaRef ds:uri="http://schemas.microsoft.com/office/2006/metadata/properties"/>
+    <ds:schemaRef ds:uri="http://schemas.microsoft.com/office/infopath/2007/PartnerControls"/>
+  </ds:schemaRefs>
+</ds:datastoreItem>
+</file>
+
+<file path=customXml/itemProps4.xml><?xml version="1.0" encoding="utf-8"?>
+<ds:datastoreItem xmlns:ds="http://schemas.openxmlformats.org/officeDocument/2006/customXml" ds:itemID="{4DA5F263-1105-4DFA-9226-3A9690489806}">
+  <ds:schemaRefs>
+    <ds:schemaRef ds:uri="http://schemas.openxmlformats.org/officeDocument/2006/bibliography"/>
+  </ds:schemaRefs>
+</ds:datastoreItem>
 </file>
</xml_diff>